<commit_message>
docs: link active YouTrack project and tasks
</commit_message>
<xml_diff>
--- a/docs/predefense/Alau_Term_predefense_revised_EN_2026-10-14.docx
+++ b/docs/predefense/Alau_Term_predefense_revised_EN_2026-10-14.docx
@@ -555,7 +555,7 @@
                 <w:color w:val="000000"/>
                 <w:sz w:val="16"/>
               </w:rPr>
-              <w:t>No interview notes, time measurements, YouTrack board or supervisor review have been supplied. No claim is made that these already exist.</w:t>
+              <w:t>No interview notes, time measurements or supervisor review have been supplied. A YouTrack project now tracks 15 open tasks; no claim is made that the remaining evidence exists.</w:t>
             </w:r>
           </w:p>
         </w:tc>
@@ -5291,7 +5291,7 @@
     </w:p>
     <w:p>
       <w:r>
-        <w:t>Repository: https://github.com/Gapo-7/DIPLOMA. Stages 1–7 form the static-source history. A working backend, CRM and test evidence must be separately traceable through issues/tasks, branches, PRs, reviewer and commit links. YouTrack has not yet been created; the plan codes below are planning labels, not YouTrack IDs. The final repository package should include README, requirements, diagrams, source list, test evidence, a YouTrack link once it exists and a checkpoint tag after review.</w:t>
+        <w:t>Repository: https://github.com/Gapo-7/DIPLOMA. Stages 1–7 form the static-source history. A working backend, CRM and test evidence must be separately traceable through issues/tasks, branches, PRs, reviewer and commit links. YouTrack project ALAU now contains 15 open tasks (ALAU-1 to ALAU-15); the plan codes below remain planning labels. The final repository package should include README, requirements, diagrams, source list, test evidence, the YouTrack project link (https://gapar1.youtrack.cloud/projects/ALAU) and a checkpoint tag after review.</w:t>
       </w:r>
     </w:p>
     <w:tbl>
@@ -5974,7 +5974,7 @@
                 <w:color w:val="000000"/>
                 <w:sz w:val="16"/>
               </w:rPr>
-              <w:t>Create YouTrack board when available; record supervisor review as pending until received; both.</w:t>
+              <w:t>Link the created YouTrack project to GitHub; record supervisor review as pending until received; both.</w:t>
             </w:r>
           </w:p>
         </w:tc>

</xml_diff>